<commit_message>
update project build.docx, add owtoolchain.zip download url
</commit_message>
<xml_diff>
--- a/doc/project build.docx
+++ b/doc/project build.docx
@@ -71,24 +71,67 @@
       <w:pPr>
         <w:pStyle w:val="a9"/>
         <w:ind w:left="360"/>
-        <w:rPr>
-          <w:rFonts w:hint="eastAsia"/>
-        </w:rPr>
       </w:pPr>
     </w:p>
     <w:p>
       <w:pPr>
         <w:pStyle w:val="a9"/>
         <w:ind w:left="360"/>
-        <w:rPr>
-          <w:rFonts w:hint="eastAsia"/>
-        </w:rPr>
-      </w:pPr>
-      <w:r>
-        <w:rPr>
-          <w:rFonts w:hint="eastAsia"/>
-        </w:rPr>
-        <w:t>Extract the owtoolchain. zip file from the tool And put it on the C drive (compiler default path</w:t>
+      </w:pPr>
+      <w:r>
+        <w:t xml:space="preserve">Please visit the following address to download the compilation chain package "owtoolchain.zip" </w:t>
+      </w:r>
+    </w:p>
+    <w:p>
+      <w:pPr>
+        <w:pStyle w:val="a9"/>
+        <w:ind w:left="360"/>
+      </w:pPr>
+      <w:hyperlink r:id="rId7" w:history="1">
+        <w:r>
+          <w:rPr>
+            <w:rStyle w:val="af2"/>
+          </w:rPr>
+          <w:t>https://drive.google.com/file/d/1yVfltWdgUpjrMy-ondYa0T5ihrqVkj3v/view?usp=sharing</w:t>
+        </w:r>
+      </w:hyperlink>
+    </w:p>
+    <w:p>
+      <w:pPr>
+        <w:pStyle w:val="a9"/>
+        <w:ind w:left="360"/>
+        <w:rPr>
+          <w:rFonts w:hint="eastAsia"/>
+        </w:rPr>
+      </w:pPr>
+    </w:p>
+    <w:p>
+      <w:pPr>
+        <w:pStyle w:val="a9"/>
+        <w:ind w:left="360"/>
+        <w:rPr>
+          <w:rFonts w:hint="eastAsia"/>
+        </w:rPr>
+      </w:pPr>
+      <w:r>
+        <w:rPr>
+          <w:rFonts w:hint="eastAsia"/>
+        </w:rPr>
+        <w:t xml:space="preserve">Extract the </w:t>
+      </w:r>
+      <w:proofErr w:type="spellStart"/>
+      <w:r>
+        <w:rPr>
+          <w:rFonts w:hint="eastAsia"/>
+        </w:rPr>
+        <w:t>owtoolchain</w:t>
+      </w:r>
+      <w:proofErr w:type="spellEnd"/>
+      <w:r>
+        <w:rPr>
+          <w:rFonts w:hint="eastAsia"/>
+        </w:rPr>
+        <w:t>. zip file from the tool And put it on the C drive (compiler default path</w:t>
       </w:r>
       <w:r>
         <w:t>,</w:t>
@@ -136,7 +179,7 @@
                     </pic:cNvPicPr>
                   </pic:nvPicPr>
                   <pic:blipFill>
-                    <a:blip r:embed="rId7">
+                    <a:blip r:embed="rId8">
                       <a:extLst>
                         <a:ext uri="{28A0092B-C50C-407E-A947-70E740481C1C}">
                           <a14:useLocalDpi xmlns:a14="http://schemas.microsoft.com/office/drawing/2010/main" val="0"/>
@@ -172,9 +215,6 @@
       <w:pPr>
         <w:pStyle w:val="a9"/>
         <w:ind w:left="360"/>
-        <w:rPr>
-          <w:rFonts w:hint="eastAsia"/>
-        </w:rPr>
       </w:pPr>
       <w:r>
         <w:rPr>
@@ -198,7 +238,7 @@
                     </pic:cNvPicPr>
                   </pic:nvPicPr>
                   <pic:blipFill>
-                    <a:blip r:embed="rId8">
+                    <a:blip r:embed="rId9">
                       <a:extLst>
                         <a:ext uri="{28A0092B-C50C-407E-A947-70E740481C1C}">
                           <a14:useLocalDpi xmlns:a14="http://schemas.microsoft.com/office/drawing/2010/main" val="0"/>
@@ -233,6 +273,21 @@
     <w:p>
       <w:pPr>
         <w:pStyle w:val="a9"/>
+        <w:ind w:left="360"/>
+      </w:pPr>
+    </w:p>
+    <w:p>
+      <w:pPr>
+        <w:pStyle w:val="a9"/>
+        <w:ind w:left="360"/>
+        <w:rPr>
+          <w:rFonts w:hint="eastAsia"/>
+        </w:rPr>
+      </w:pPr>
+    </w:p>
+    <w:p>
+      <w:pPr>
+        <w:pStyle w:val="a9"/>
         <w:numPr>
           <w:ilvl w:val="0"/>
           <w:numId w:val="1"/>
@@ -276,11 +331,10 @@
         <w:rPr>
           <w:noProof/>
         </w:rPr>
-        <w:lastRenderedPageBreak/>
         <w:drawing>
-          <wp:inline distT="0" distB="0" distL="0" distR="0" wp14:anchorId="5D7EF79E" wp14:editId="3DBB5453">
-            <wp:extent cx="5274310" cy="1789430"/>
-            <wp:effectExtent l="0" t="0" r="2540" b="1270"/>
+          <wp:inline distT="0" distB="0" distL="0" distR="0" wp14:anchorId="5D7EF79E" wp14:editId="65AE4BF4">
+            <wp:extent cx="4911834" cy="1666452"/>
+            <wp:effectExtent l="0" t="0" r="3175" b="0"/>
             <wp:docPr id="648983554" name="图片 1"/>
             <wp:cNvGraphicFramePr>
               <a:graphicFrameLocks xmlns:a="http://schemas.openxmlformats.org/drawingml/2006/main" noChangeAspect="1"/>
@@ -295,7 +349,7 @@
                     </pic:cNvPicPr>
                   </pic:nvPicPr>
                   <pic:blipFill>
-                    <a:blip r:embed="rId9">
+                    <a:blip r:embed="rId10">
                       <a:extLst>
                         <a:ext uri="{28A0092B-C50C-407E-A947-70E740481C1C}">
                           <a14:useLocalDpi xmlns:a14="http://schemas.microsoft.com/office/drawing/2010/main" val="0"/>
@@ -310,7 +364,7 @@
                   <pic:spPr bwMode="auto">
                     <a:xfrm>
                       <a:off x="0" y="0"/>
-                      <a:ext cx="5274310" cy="1789430"/>
+                      <a:ext cx="4926503" cy="1671429"/>
                     </a:xfrm>
                     <a:prstGeom prst="rect">
                       <a:avLst/>
@@ -370,7 +424,7 @@
                     </pic:cNvPicPr>
                   </pic:nvPicPr>
                   <pic:blipFill>
-                    <a:blip r:embed="rId10">
+                    <a:blip r:embed="rId11">
                       <a:extLst>
                         <a:ext uri="{28A0092B-C50C-407E-A947-70E740481C1C}">
                           <a14:useLocalDpi xmlns:a14="http://schemas.microsoft.com/office/drawing/2010/main" val="0"/>
@@ -471,7 +525,7 @@
                     </pic:cNvPicPr>
                   </pic:nvPicPr>
                   <pic:blipFill>
-                    <a:blip r:embed="rId11">
+                    <a:blip r:embed="rId12">
                       <a:extLst>
                         <a:ext uri="{28A0092B-C50C-407E-A947-70E740481C1C}">
                           <a14:useLocalDpi xmlns:a14="http://schemas.microsoft.com/office/drawing/2010/main" val="0"/>
@@ -558,7 +612,7 @@
                     </pic:cNvPicPr>
                   </pic:nvPicPr>
                   <pic:blipFill>
-                    <a:blip r:embed="rId12">
+                    <a:blip r:embed="rId13">
                       <a:extLst>
                         <a:ext uri="{28A0092B-C50C-407E-A947-70E740481C1C}">
                           <a14:useLocalDpi xmlns:a14="http://schemas.microsoft.com/office/drawing/2010/main" val="0"/>
@@ -698,7 +752,7 @@
                     </pic:cNvPicPr>
                   </pic:nvPicPr>
                   <pic:blipFill>
-                    <a:blip r:embed="rId13">
+                    <a:blip r:embed="rId14">
                       <a:extLst>
                         <a:ext uri="{28A0092B-C50C-407E-A947-70E740481C1C}">
                           <a14:useLocalDpi xmlns:a14="http://schemas.microsoft.com/office/drawing/2010/main" val="0"/>
@@ -733,6 +787,7 @@
     <w:p>
       <w:pPr>
         <w:rPr>
+          <w:rFonts w:hint="eastAsia"/>
           <w:noProof/>
         </w:rPr>
       </w:pPr>
@@ -792,7 +847,7 @@
                     </pic:cNvPicPr>
                   </pic:nvPicPr>
                   <pic:blipFill>
-                    <a:blip r:embed="rId14">
+                    <a:blip r:embed="rId15">
                       <a:extLst>
                         <a:ext uri="{28A0092B-C50C-407E-A947-70E740481C1C}">
                           <a14:useLocalDpi xmlns:a14="http://schemas.microsoft.com/office/drawing/2010/main" val="0"/>
@@ -825,6 +880,11 @@
       </w:r>
     </w:p>
     <w:p>
+      <w:pPr>
+        <w:rPr>
+          <w:rFonts w:hint="eastAsia"/>
+        </w:rPr>
+      </w:pPr>
       <w:r>
         <w:rPr>
           <w:rFonts w:hint="eastAsia"/>
@@ -832,8 +892,19 @@
         <w:t>After entering the menu again, it indicates that the configuration has been completed</w:t>
       </w:r>
     </w:p>
-    <w:p/>
-    <w:p>
+    <w:p>
+      <w:pPr>
+        <w:rPr>
+          <w:rFonts w:hint="eastAsia"/>
+        </w:rPr>
+      </w:pPr>
+    </w:p>
+    <w:p>
+      <w:pPr>
+        <w:rPr>
+          <w:rFonts w:hint="eastAsia"/>
+        </w:rPr>
+      </w:pPr>
       <w:r>
         <w:rPr>
           <w:rFonts w:hint="eastAsia"/>
@@ -882,6 +953,9 @@
           <w:ilvl w:val="0"/>
           <w:numId w:val="2"/>
         </w:numPr>
+        <w:rPr>
+          <w:rFonts w:hint="eastAsia"/>
+        </w:rPr>
       </w:pPr>
       <w:r>
         <w:rPr>
@@ -920,7 +994,7 @@
                     </pic:cNvPicPr>
                   </pic:nvPicPr>
                   <pic:blipFill>
-                    <a:blip r:embed="rId15">
+                    <a:blip r:embed="rId16">
                       <a:extLst>
                         <a:ext uri="{28A0092B-C50C-407E-A947-70E740481C1C}">
                           <a14:useLocalDpi xmlns:a14="http://schemas.microsoft.com/office/drawing/2010/main" val="0"/>
@@ -1000,7 +1074,7 @@
                     </pic:cNvPicPr>
                   </pic:nvPicPr>
                   <pic:blipFill>
-                    <a:blip r:embed="rId16">
+                    <a:blip r:embed="rId17">
                       <a:extLst>
                         <a:ext uri="{28A0092B-C50C-407E-A947-70E740481C1C}">
                           <a14:useLocalDpi xmlns:a14="http://schemas.microsoft.com/office/drawing/2010/main" val="0"/>
@@ -1062,7 +1136,7 @@
                     </pic:cNvPicPr>
                   </pic:nvPicPr>
                   <pic:blipFill>
-                    <a:blip r:embed="rId17">
+                    <a:blip r:embed="rId18">
                       <a:extLst>
                         <a:ext uri="{28A0092B-C50C-407E-A947-70E740481C1C}">
                           <a14:useLocalDpi xmlns:a14="http://schemas.microsoft.com/office/drawing/2010/main" val="0"/>
@@ -1132,7 +1206,7 @@
         </w:rPr>
         <w:lastRenderedPageBreak/>
         <w:drawing>
-          <wp:inline distT="0" distB="0" distL="0" distR="0" wp14:anchorId="79FE5278" wp14:editId="297C1FA5">
+          <wp:inline distT="0" distB="0" distL="0" distR="0" wp14:anchorId="79FE5278" wp14:editId="48A71BEF">
             <wp:extent cx="5274310" cy="2645410"/>
             <wp:effectExtent l="0" t="0" r="2540" b="2540"/>
             <wp:docPr id="963230575" name="图片 11"/>
@@ -1149,7 +1223,7 @@
                     </pic:cNvPicPr>
                   </pic:nvPicPr>
                   <pic:blipFill>
-                    <a:blip r:embed="rId18" cstate="print">
+                    <a:blip r:embed="rId19" cstate="print">
                       <a:extLst>
                         <a:ext uri="{28A0092B-C50C-407E-A947-70E740481C1C}">
                           <a14:useLocalDpi xmlns:a14="http://schemas.microsoft.com/office/drawing/2010/main" val="0"/>
@@ -1243,14 +1317,7 @@
           <w:rFonts w:hint="eastAsia"/>
           <w:highlight w:val="yellow"/>
         </w:rPr>
-        <w:t>DS200_4GW_V91_100_R07A04_EC600MCN_LA_20260507</w:t>
-      </w:r>
-      <w:r>
-        <w:rPr>
-          <w:rFonts w:hint="eastAsia"/>
-          <w:highlight w:val="yellow"/>
-        </w:rPr>
-        <w:t>.zip</w:t>
+        <w:t>DS200_4GW_V91_100_R07A04_EC600MCN_LA_20260507.zip</w:t>
       </w:r>
     </w:p>
     <w:p>
@@ -1294,7 +1361,21 @@
         <w:rPr>
           <w:rFonts w:hint="eastAsia"/>
         </w:rPr>
-        <w:t>Run tool/download_tool/QMulti_SL_V2.6/QMulti_SL_V2.6.exe</w:t>
+        <w:t>Run tool/</w:t>
+      </w:r>
+      <w:proofErr w:type="spellStart"/>
+      <w:r>
+        <w:rPr>
+          <w:rFonts w:hint="eastAsia"/>
+        </w:rPr>
+        <w:t>download_tool</w:t>
+      </w:r>
+      <w:proofErr w:type="spellEnd"/>
+      <w:r>
+        <w:rPr>
+          <w:rFonts w:hint="eastAsia"/>
+        </w:rPr>
+        <w:t>/QMulti_SL_V2.6/QMulti_SL_V2.6.exe</w:t>
       </w:r>
     </w:p>
     <w:p>
@@ -1309,7 +1390,7 @@
           <w:noProof/>
         </w:rPr>
         <w:drawing>
-          <wp:inline distT="0" distB="0" distL="0" distR="0" wp14:anchorId="2A619EB3" wp14:editId="5DEEB3FF">
+          <wp:inline distT="0" distB="0" distL="0" distR="0" wp14:anchorId="2A619EB3" wp14:editId="4C112436">
             <wp:extent cx="5274310" cy="2692400"/>
             <wp:effectExtent l="0" t="0" r="2540" b="0"/>
             <wp:docPr id="1882738907" name="图片 12"/>
@@ -1326,7 +1407,7 @@
                     </pic:cNvPicPr>
                   </pic:nvPicPr>
                   <pic:blipFill>
-                    <a:blip r:embed="rId19" cstate="print">
+                    <a:blip r:embed="rId20" cstate="print">
                       <a:extLst>
                         <a:ext uri="{28A0092B-C50C-407E-A947-70E740481C1C}">
                           <a14:useLocalDpi xmlns:a14="http://schemas.microsoft.com/office/drawing/2010/main" val="0"/>
@@ -1413,7 +1494,7 @@
         </w:rPr>
         <w:lastRenderedPageBreak/>
         <w:drawing>
-          <wp:inline distT="0" distB="0" distL="0" distR="0" wp14:anchorId="09499A9F" wp14:editId="22597BCA">
+          <wp:inline distT="0" distB="0" distL="0" distR="0" wp14:anchorId="09499A9F" wp14:editId="75D01DB8">
             <wp:extent cx="5274310" cy="2026920"/>
             <wp:effectExtent l="0" t="0" r="2540" b="0"/>
             <wp:docPr id="391436238" name="图片 14"/>
@@ -1430,7 +1511,7 @@
                     </pic:cNvPicPr>
                   </pic:nvPicPr>
                   <pic:blipFill>
-                    <a:blip r:embed="rId20" cstate="print">
+                    <a:blip r:embed="rId21" cstate="print">
                       <a:extLst>
                         <a:ext uri="{28A0092B-C50C-407E-A947-70E740481C1C}">
                           <a14:useLocalDpi xmlns:a14="http://schemas.microsoft.com/office/drawing/2010/main" val="0"/>
@@ -1498,7 +1579,7 @@
           <w:noProof/>
         </w:rPr>
         <w:drawing>
-          <wp:inline distT="0" distB="0" distL="0" distR="0" wp14:anchorId="092774A6" wp14:editId="293CF396">
+          <wp:inline distT="0" distB="0" distL="0" distR="0" wp14:anchorId="092774A6" wp14:editId="4FD33CCB">
             <wp:extent cx="5274310" cy="1661795"/>
             <wp:effectExtent l="0" t="0" r="2540" b="0"/>
             <wp:docPr id="1078915924" name="图片 15"/>
@@ -1515,7 +1596,7 @@
                     </pic:cNvPicPr>
                   </pic:nvPicPr>
                   <pic:blipFill>
-                    <a:blip r:embed="rId21" cstate="print">
+                    <a:blip r:embed="rId22" cstate="print">
                       <a:extLst>
                         <a:ext uri="{28A0092B-C50C-407E-A947-70E740481C1C}">
                           <a14:useLocalDpi xmlns:a14="http://schemas.microsoft.com/office/drawing/2010/main" val="0"/>
@@ -1627,7 +1708,7 @@
                     </pic:cNvPicPr>
                   </pic:nvPicPr>
                   <pic:blipFill>
-                    <a:blip r:embed="rId14">
+                    <a:blip r:embed="rId15">
                       <a:extLst>
                         <a:ext uri="{28A0092B-C50C-407E-A947-70E740481C1C}">
                           <a14:useLocalDpi xmlns:a14="http://schemas.microsoft.com/office/drawing/2010/main" val="0"/>
@@ -1690,7 +1771,7 @@
         </w:rPr>
         <w:lastRenderedPageBreak/>
         <w:drawing>
-          <wp:inline distT="0" distB="0" distL="0" distR="0" wp14:anchorId="22133340" wp14:editId="75BF754C">
+          <wp:inline distT="0" distB="0" distL="0" distR="0" wp14:anchorId="22133340" wp14:editId="13236480">
             <wp:extent cx="5274310" cy="2723515"/>
             <wp:effectExtent l="0" t="0" r="2540" b="635"/>
             <wp:docPr id="978661658" name="图片 1"/>
@@ -1707,7 +1788,7 @@
                     </pic:cNvPicPr>
                   </pic:nvPicPr>
                   <pic:blipFill>
-                    <a:blip r:embed="rId22" cstate="print">
+                    <a:blip r:embed="rId23" cstate="print">
                       <a:extLst>
                         <a:ext uri="{28A0092B-C50C-407E-A947-70E740481C1C}">
                           <a14:useLocalDpi xmlns:a14="http://schemas.microsoft.com/office/drawing/2010/main" val="0"/>
@@ -1787,7 +1868,7 @@
                     </pic:cNvPicPr>
                   </pic:nvPicPr>
                   <pic:blipFill>
-                    <a:blip r:embed="rId23">
+                    <a:blip r:embed="rId24">
                       <a:extLst>
                         <a:ext uri="{28A0092B-C50C-407E-A947-70E740481C1C}">
                           <a14:useLocalDpi xmlns:a14="http://schemas.microsoft.com/office/drawing/2010/main" val="0"/>
@@ -1898,8 +1979,16 @@
         <w:rPr>
           <w:rFonts w:hint="eastAsia"/>
         </w:rPr>
-        <w:t xml:space="preserve"> usb</w:t>
-      </w:r>
+        <w:t xml:space="preserve"> </w:t>
+      </w:r>
+      <w:proofErr w:type="spellStart"/>
+      <w:r>
+        <w:rPr>
+          <w:rFonts w:hint="eastAsia"/>
+        </w:rPr>
+        <w:t>usb</w:t>
+      </w:r>
+      <w:proofErr w:type="spellEnd"/>
       <w:r>
         <w:rPr>
           <w:rFonts w:hint="eastAsia"/>
@@ -1966,12 +2055,14 @@
         </w:rPr>
         <w:t xml:space="preserve">Open </w:t>
       </w:r>
+      <w:proofErr w:type="spellStart"/>
       <w:r>
         <w:rPr>
           <w:rFonts w:hint="eastAsia"/>
         </w:rPr>
         <w:t>system_parameters_setting_tool</w:t>
       </w:r>
+      <w:proofErr w:type="spellEnd"/>
       <w:r>
         <w:rPr>
           <w:rFonts w:hint="eastAsia"/>
@@ -1999,7 +2090,7 @@
         </w:rPr>
         <w:lastRenderedPageBreak/>
         <w:drawing>
-          <wp:inline distT="0" distB="0" distL="0" distR="0" wp14:anchorId="1E5318E7" wp14:editId="04EC3BD1">
+          <wp:inline distT="0" distB="0" distL="0" distR="0" wp14:anchorId="1E5318E7" wp14:editId="31B1F57C">
             <wp:extent cx="3556861" cy="2354398"/>
             <wp:effectExtent l="0" t="0" r="5715" b="8255"/>
             <wp:docPr id="1760242829" name="图片 3"/>
@@ -2016,7 +2107,7 @@
                     </pic:cNvPicPr>
                   </pic:nvPicPr>
                   <pic:blipFill>
-                    <a:blip r:embed="rId24" cstate="print">
+                    <a:blip r:embed="rId25" cstate="print">
                       <a:extLst>
                         <a:ext uri="{28A0092B-C50C-407E-A947-70E740481C1C}">
                           <a14:useLocalDpi xmlns:a14="http://schemas.microsoft.com/office/drawing/2010/main" val="0"/>
@@ -2096,7 +2187,7 @@
                     </pic:cNvPicPr>
                   </pic:nvPicPr>
                   <pic:blipFill>
-                    <a:blip r:embed="rId25">
+                    <a:blip r:embed="rId26">
                       <a:extLst>
                         <a:ext uri="{28A0092B-C50C-407E-A947-70E740481C1C}">
                           <a14:useLocalDpi xmlns:a14="http://schemas.microsoft.com/office/drawing/2010/main" val="0"/>
@@ -2168,7 +2259,7 @@
                     </pic:cNvPicPr>
                   </pic:nvPicPr>
                   <pic:blipFill>
-                    <a:blip r:embed="rId26">
+                    <a:blip r:embed="rId27">
                       <a:extLst>
                         <a:ext uri="{28A0092B-C50C-407E-A947-70E740481C1C}">
                           <a14:useLocalDpi xmlns:a14="http://schemas.microsoft.com/office/drawing/2010/main" val="0"/>
@@ -2215,7 +2306,21 @@
         <w:rPr>
           <w:rFonts w:hint="eastAsia"/>
         </w:rPr>
-        <w:t>Click on the LogStatus parameter</w:t>
+        <w:t xml:space="preserve">Click on the </w:t>
+      </w:r>
+      <w:proofErr w:type="spellStart"/>
+      <w:r>
+        <w:rPr>
+          <w:rFonts w:hint="eastAsia"/>
+        </w:rPr>
+        <w:t>LogStatus</w:t>
+      </w:r>
+      <w:proofErr w:type="spellEnd"/>
+      <w:r>
+        <w:rPr>
+          <w:rFonts w:hint="eastAsia"/>
+        </w:rPr>
+        <w:t xml:space="preserve"> parameter</w:t>
       </w:r>
     </w:p>
     <w:p>
@@ -2248,7 +2353,7 @@
                     </pic:cNvPicPr>
                   </pic:nvPicPr>
                   <pic:blipFill>
-                    <a:blip r:embed="rId27" cstate="print">
+                    <a:blip r:embed="rId28" cstate="print">
                       <a:extLst>
                         <a:ext uri="{28A0092B-C50C-407E-A947-70E740481C1C}">
                           <a14:useLocalDpi xmlns:a14="http://schemas.microsoft.com/office/drawing/2010/main" val="0"/>
@@ -2365,7 +2470,7 @@
                     </pic:cNvPicPr>
                   </pic:nvPicPr>
                   <pic:blipFill>
-                    <a:blip r:embed="rId28">
+                    <a:blip r:embed="rId29">
                       <a:extLst>
                         <a:ext uri="{28A0092B-C50C-407E-A947-70E740481C1C}">
                           <a14:useLocalDpi xmlns:a14="http://schemas.microsoft.com/office/drawing/2010/main" val="0"/>
@@ -2427,7 +2532,7 @@
                     </pic:cNvPicPr>
                   </pic:nvPicPr>
                   <pic:blipFill>
-                    <a:blip r:embed="rId29">
+                    <a:blip r:embed="rId30">
                       <a:extLst>
                         <a:ext uri="{28A0092B-C50C-407E-A947-70E740481C1C}">
                           <a14:useLocalDpi xmlns:a14="http://schemas.microsoft.com/office/drawing/2010/main" val="0"/>
@@ -2489,7 +2594,7 @@
                     </pic:cNvPicPr>
                   </pic:nvPicPr>
                   <pic:blipFill>
-                    <a:blip r:embed="rId30">
+                    <a:blip r:embed="rId31">
                       <a:extLst>
                         <a:ext uri="{28A0092B-C50C-407E-A947-70E740481C1C}">
                           <a14:useLocalDpi xmlns:a14="http://schemas.microsoft.com/office/drawing/2010/main" val="0"/>
@@ -2630,7 +2735,7 @@
                     </pic:cNvPicPr>
                   </pic:nvPicPr>
                   <pic:blipFill>
-                    <a:blip r:embed="rId31">
+                    <a:blip r:embed="rId32">
                       <a:extLst>
                         <a:ext uri="{28A0092B-C50C-407E-A947-70E740481C1C}">
                           <a14:useLocalDpi xmlns:a14="http://schemas.microsoft.com/office/drawing/2010/main" val="0"/>
@@ -2707,7 +2812,7 @@
                     </pic:cNvPicPr>
                   </pic:nvPicPr>
                   <pic:blipFill>
-                    <a:blip r:embed="rId32">
+                    <a:blip r:embed="rId33">
                       <a:extLst>
                         <a:ext uri="{28A0092B-C50C-407E-A947-70E740481C1C}">
                           <a14:useLocalDpi xmlns:a14="http://schemas.microsoft.com/office/drawing/2010/main" val="0"/>
@@ -3889,7 +3994,6 @@
   <w:style w:type="character" w:default="1" w:styleId="a0">
     <w:name w:val="Default Paragraph Font"/>
     <w:uiPriority w:val="1"/>
-    <w:semiHidden/>
     <w:unhideWhenUsed/>
   </w:style>
   <w:style w:type="table" w:default="1" w:styleId="a1">
@@ -4270,6 +4374,29 @@
       <w:szCs w:val="18"/>
     </w:rPr>
   </w:style>
+  <w:style w:type="character" w:styleId="af2">
+    <w:name w:val="Hyperlink"/>
+    <w:basedOn w:val="a0"/>
+    <w:uiPriority w:val="99"/>
+    <w:unhideWhenUsed/>
+    <w:rsid w:val="005C3EB9"/>
+    <w:rPr>
+      <w:color w:val="0563C1" w:themeColor="hyperlink"/>
+      <w:u w:val="single"/>
+    </w:rPr>
+  </w:style>
+  <w:style w:type="character" w:styleId="af3">
+    <w:name w:val="Unresolved Mention"/>
+    <w:basedOn w:val="a0"/>
+    <w:uiPriority w:val="99"/>
+    <w:semiHidden/>
+    <w:unhideWhenUsed/>
+    <w:rsid w:val="005C3EB9"/>
+    <w:rPr>
+      <w:color w:val="605E5C"/>
+      <w:shd w:val="clear" w:color="auto" w:fill="E1DFDD"/>
+    </w:rPr>
+  </w:style>
 </w:styles>
 </file>
 

</xml_diff>